<commit_message>
Update: weekly dashboard without 万播收益 (2x2 layout)
</commit_message>
<xml_diff>
--- a/docs/final/internal_data/weekly.docx
+++ b/docs/final/internal_data/weekly.docx
@@ -38,7 +38,7 @@
       <w:r>
         <w:drawing>
           <wp:inline xmlns:a="http://schemas.openxmlformats.org/drawingml/2006/main" xmlns:pic="http://schemas.openxmlformats.org/drawingml/2006/picture">
-            <wp:extent cx="5029200" cy="3736037"/>
+            <wp:extent cx="5029200" cy="3564361"/>
             <wp:docPr id="1" name="Picture 1"/>
             <wp:cNvGraphicFramePr>
               <a:graphicFrameLocks noChangeAspect="1"/>
@@ -59,7 +59,7 @@
                   <pic:spPr>
                     <a:xfrm>
                       <a:off x="0" y="0"/>
-                      <a:ext cx="5029200" cy="3736037"/>
+                      <a:ext cx="5029200" cy="3564361"/>
                     </a:xfrm>
                     <a:prstGeom prst="rect"/>
                   </pic:spPr>
@@ -80,7 +80,7 @@
           <w:color w:val="000000"/>
           <w:sz w:val="22"/>
         </w:rPr>
-        <w:t>W4（4/20-26）为播放量与收益峰值周，都市题材播放量61.3万，女频收益659元占当周总收益的52%。</w:t>
+        <w:t>W4（4/20-26）为播放量与收益峰值周，都市题材播放量61.3万、收益665元，占当周主导。女频W4播放量51.7万、收益659元，贡献当周52%收益。</w:t>
       </w:r>
     </w:p>
     <w:p>
@@ -93,7 +93,7 @@
           <w:color w:val="000000"/>
           <w:sz w:val="22"/>
         </w:rPr>
-        <w:t>万播收益方面，玄幻题材整体表现最优（17.7元/万播），女频与男频变现效率接近（16.7元 vs 16.7元）。</w:t>
+        <w:t>W1无数据产出，W2起逐步放量，W4达峰值后W5小幅回落。</w:t>
       </w:r>
     </w:p>
     <w:sectPr>

</xml_diff>